<commit_message>
feat(ateliers): update Exercice 05 to social media video challenge (media literacy in 50 min)
</commit_message>
<xml_diff>
--- a/docs/public/documents/Exercice-05.docx
+++ b/docs/public/documents/Exercice-05.docx
@@ -30,7 +30,17 @@
           <w:sz w:val="32"/>
           <w:szCs w:val="32"/>
         </w:rPr>
-        <w:t>Défi — Créer une affiche numérique</w:t>
+        <w:t xml:space="preserve">Défi — </w:t>
+      </w:r>
+      <w:r>
+        <w:rPr>
+          <w:rFonts w:ascii="Segoe UI" w:hAnsi="Segoe UI" w:cs="Segoe UI"/>
+          <w:b/>
+          <w:bCs/>
+          <w:sz w:val="32"/>
+          <w:szCs w:val="32"/>
+        </w:rPr>
+        <w:t>créer une vidéo pour les réseaux sociaux</w:t>
       </w:r>
     </w:p>
     <w:p>
@@ -42,8 +52,58 @@
       <w:r>
         <w:rPr>
           <w:rFonts w:ascii="Segoe UI" w:hAnsi="Segoe UI" w:cs="Segoe UI"/>
-        </w:rPr>
-        <w:t>Votre mission</w:t>
+          <w:b/>
+          <w:bCs/>
+        </w:rPr>
+        <w:t>Défi :</w:t>
+      </w:r>
+      <w:r>
+        <w:rPr>
+          <w:rFonts w:ascii="Segoe UI" w:hAnsi="Segoe UI" w:cs="Segoe UI"/>
+        </w:rPr>
+        <w:t xml:space="preserve"> en </w:t>
+      </w:r>
+      <w:r>
+        <w:rPr>
+          <w:rFonts w:ascii="Segoe UI" w:hAnsi="Segoe UI" w:cs="Segoe UI"/>
+          <w:b/>
+          <w:bCs/>
+        </w:rPr>
+        <w:t>50 minutes</w:t>
+      </w:r>
+      <w:r>
+        <w:rPr>
+          <w:rFonts w:ascii="Segoe UI" w:hAnsi="Segoe UI" w:cs="Segoe UI"/>
+        </w:rPr>
+        <w:t xml:space="preserve">, concevez et réalisez une vidéo de </w:t>
+      </w:r>
+      <w:r>
+        <w:rPr>
+          <w:rFonts w:ascii="Segoe UI" w:hAnsi="Segoe UI" w:cs="Segoe UI"/>
+          <w:b/>
+          <w:bCs/>
+        </w:rPr>
+        <w:t>30 secondes à 1 minute</w:t>
+      </w:r>
+      <w:r>
+        <w:rPr>
+          <w:rFonts w:ascii="Segoe UI" w:hAnsi="Segoe UI" w:cs="Segoe UI"/>
+        </w:rPr>
+        <w:t xml:space="preserve"> destinée aux réseaux sociaux pour sensibiliser un public scolaire à </w:t>
+      </w:r>
+      <w:r>
+        <w:rPr>
+          <w:rFonts w:ascii="Segoe UI" w:hAnsi="Segoe UI" w:cs="Segoe UI"/>
+          <w:b/>
+          <w:bCs/>
+        </w:rPr>
+        <w:t>un enjeu d’éducation aux médias</w:t>
+      </w:r>
+      <w:r>
+        <w:rPr>
+          <w:rFonts w:ascii="Segoe UI" w:hAnsi="Segoe UI" w:cs="Segoe UI"/>
+        </w:rPr>
+        <w:t>.</w:t>
       </w:r>
     </w:p>
     <w:p>
@@ -56,21 +116,41 @@
         <w:rPr>
           <w:rFonts w:ascii="Segoe UI" w:hAnsi="Segoe UI" w:cs="Segoe UI"/>
         </w:rPr>
-        <w:t xml:space="preserve">En 20 minutes, créez avec </w:t>
-      </w:r>
-      <w:proofErr w:type="spellStart"/>
-      <w:r>
-        <w:rPr>
-          <w:rFonts w:ascii="Segoe UI" w:hAnsi="Segoe UI" w:cs="Segoe UI"/>
-        </w:rPr>
-        <w:t>Canva</w:t>
-      </w:r>
-      <w:proofErr w:type="spellEnd"/>
-      <w:r>
-        <w:rPr>
-          <w:rFonts w:ascii="Segoe UI" w:hAnsi="Segoe UI" w:cs="Segoe UI"/>
-        </w:rPr>
-        <w:t xml:space="preserve"> une affiche numérique qui permette à un élève de comprendre en moins de 30 secondes comment créer un mot de passe sécurisé.</w:t>
+        <w:t xml:space="preserve">Vous pouvez vous inspirer des codes de créateurs de contenus et de chaînes spécialisées, </w:t>
+      </w:r>
+      <w:proofErr w:type="gramStart"/>
+      <w:r>
+        <w:rPr>
+          <w:rFonts w:ascii="Segoe UI" w:hAnsi="Segoe UI" w:cs="Segoe UI"/>
+        </w:rPr>
+        <w:t>comme</w:t>
+      </w:r>
+      <w:r>
+        <w:rPr>
+          <w:rFonts w:ascii="Segoe UI" w:hAnsi="Segoe UI" w:cs="Segoe UI"/>
+        </w:rPr>
+        <w:t xml:space="preserve"> par exemple</w:t>
+      </w:r>
+      <w:proofErr w:type="gramEnd"/>
+      <w:r>
+        <w:rPr>
+          <w:rFonts w:ascii="Segoe UI" w:hAnsi="Segoe UI" w:cs="Segoe UI"/>
+        </w:rPr>
+        <w:t xml:space="preserve"> </w:t>
+      </w:r>
+      <w:r>
+        <w:rPr>
+          <w:rFonts w:ascii="Segoe UI" w:hAnsi="Segoe UI" w:cs="Segoe UI"/>
+          <w:b/>
+          <w:bCs/>
+        </w:rPr>
+        <w:t>Esprit critique</w:t>
+      </w:r>
+      <w:r>
+        <w:rPr>
+          <w:rFonts w:ascii="Segoe UI" w:hAnsi="Segoe UI" w:cs="Segoe UI"/>
+        </w:rPr>
+        <w:t>, tout en développant votre propre concept.</w:t>
       </w:r>
     </w:p>
     <w:p>
@@ -87,123 +167,370 @@
           <w:b/>
           <w:bCs/>
         </w:rPr>
-        <w:t>Contraintes</w:t>
+        <w:t>Votre mission</w:t>
       </w:r>
     </w:p>
     <w:p>
       <w:pPr>
+        <w:rPr>
+          <w:rFonts w:ascii="Segoe UI" w:hAnsi="Segoe UI" w:cs="Segoe UI"/>
+        </w:rPr>
+      </w:pPr>
+      <w:r>
+        <w:rPr>
+          <w:rFonts w:ascii="Segoe UI" w:hAnsi="Segoe UI" w:cs="Segoe UI"/>
+        </w:rPr>
+        <w:t xml:space="preserve">En équipe, choisissez </w:t>
+      </w:r>
+      <w:r>
+        <w:rPr>
+          <w:rFonts w:ascii="Segoe UI" w:hAnsi="Segoe UI" w:cs="Segoe UI"/>
+          <w:b/>
+          <w:bCs/>
+        </w:rPr>
+        <w:t>un point précis d’éducation aux médias</w:t>
+      </w:r>
+      <w:r>
+        <w:rPr>
+          <w:rFonts w:ascii="Segoe UI" w:hAnsi="Segoe UI" w:cs="Segoe UI"/>
+        </w:rPr>
+        <w:t>, par exemple :</w:t>
+      </w:r>
+    </w:p>
+    <w:p>
+      <w:pPr>
         <w:numPr>
           <w:ilvl w:val="0"/>
-          <w:numId w:val="1"/>
+          <w:numId w:val="3"/>
         </w:numPr>
         <w:rPr>
           <w:rFonts w:ascii="Segoe UI" w:hAnsi="Segoe UI" w:cs="Segoe UI"/>
         </w:rPr>
       </w:pPr>
-      <w:r>
-        <w:rPr>
-          <w:rFonts w:ascii="Segoe UI" w:hAnsi="Segoe UI" w:cs="Segoe UI"/>
-        </w:rPr>
-        <w:t xml:space="preserve">Utilisez </w:t>
-      </w:r>
-      <w:proofErr w:type="spellStart"/>
-      <w:r>
-        <w:rPr>
-          <w:rFonts w:ascii="Segoe UI" w:hAnsi="Segoe UI" w:cs="Segoe UI"/>
-        </w:rPr>
-        <w:t>Canva</w:t>
-      </w:r>
-      <w:proofErr w:type="spellEnd"/>
-      <w:r>
-        <w:rPr>
-          <w:rFonts w:ascii="Segoe UI" w:hAnsi="Segoe UI" w:cs="Segoe UI"/>
-        </w:rPr>
-        <w:t xml:space="preserve"> pour réaliser votre affiche.</w:t>
+      <w:proofErr w:type="gramStart"/>
+      <w:r>
+        <w:rPr>
+          <w:rFonts w:ascii="Segoe UI" w:hAnsi="Segoe UI" w:cs="Segoe UI"/>
+        </w:rPr>
+        <w:t>reconnaître</w:t>
+      </w:r>
+      <w:proofErr w:type="gramEnd"/>
+      <w:r>
+        <w:rPr>
+          <w:rFonts w:ascii="Segoe UI" w:hAnsi="Segoe UI" w:cs="Segoe UI"/>
+        </w:rPr>
+        <w:t xml:space="preserve"> </w:t>
+      </w:r>
+      <w:proofErr w:type="gramStart"/>
+      <w:r>
+        <w:rPr>
+          <w:rFonts w:ascii="Segoe UI" w:hAnsi="Segoe UI" w:cs="Segoe UI"/>
+        </w:rPr>
+        <w:t>une fake news</w:t>
+      </w:r>
+      <w:proofErr w:type="gramEnd"/>
+      <w:r>
+        <w:rPr>
+          <w:rFonts w:ascii="Segoe UI" w:hAnsi="Segoe UI" w:cs="Segoe UI"/>
+        </w:rPr>
+        <w:t xml:space="preserve"> ou une information douteuse ;</w:t>
       </w:r>
     </w:p>
     <w:p>
       <w:pPr>
         <w:numPr>
           <w:ilvl w:val="0"/>
-          <w:numId w:val="1"/>
+          <w:numId w:val="3"/>
         </w:numPr>
         <w:rPr>
           <w:rFonts w:ascii="Segoe UI" w:hAnsi="Segoe UI" w:cs="Segoe UI"/>
         </w:rPr>
       </w:pPr>
-      <w:r>
-        <w:rPr>
-          <w:rFonts w:ascii="Segoe UI" w:hAnsi="Segoe UI" w:cs="Segoe UI"/>
-        </w:rPr>
-        <w:t>Votre affiche doit comporter maximum 30 mots.</w:t>
+      <w:proofErr w:type="gramStart"/>
+      <w:r>
+        <w:rPr>
+          <w:rFonts w:ascii="Segoe UI" w:hAnsi="Segoe UI" w:cs="Segoe UI"/>
+        </w:rPr>
+        <w:t>identifier</w:t>
+      </w:r>
+      <w:proofErr w:type="gramEnd"/>
+      <w:r>
+        <w:rPr>
+          <w:rFonts w:ascii="Segoe UI" w:hAnsi="Segoe UI" w:cs="Segoe UI"/>
+        </w:rPr>
+        <w:t xml:space="preserve"> une source fiable ;</w:t>
       </w:r>
     </w:p>
     <w:p>
       <w:pPr>
         <w:numPr>
           <w:ilvl w:val="0"/>
-          <w:numId w:val="1"/>
+          <w:numId w:val="3"/>
         </w:numPr>
         <w:rPr>
           <w:rFonts w:ascii="Segoe UI" w:hAnsi="Segoe UI" w:cs="Segoe UI"/>
         </w:rPr>
       </w:pPr>
-      <w:r>
-        <w:rPr>
-          <w:rFonts w:ascii="Segoe UI" w:hAnsi="Segoe UI" w:cs="Segoe UI"/>
-        </w:rPr>
-        <w:t>Vous pouvez utiliser maximum 3 éléments visuels (images, icônes, illustrations…).</w:t>
+      <w:proofErr w:type="gramStart"/>
+      <w:r>
+        <w:rPr>
+          <w:rFonts w:ascii="Segoe UI" w:hAnsi="Segoe UI" w:cs="Segoe UI"/>
+        </w:rPr>
+        <w:t>comprendre</w:t>
+      </w:r>
+      <w:proofErr w:type="gramEnd"/>
+      <w:r>
+        <w:rPr>
+          <w:rFonts w:ascii="Segoe UI" w:hAnsi="Segoe UI" w:cs="Segoe UI"/>
+        </w:rPr>
+        <w:t xml:space="preserve"> les biais cognitifs ;</w:t>
       </w:r>
     </w:p>
     <w:p>
       <w:pPr>
         <w:numPr>
           <w:ilvl w:val="0"/>
-          <w:numId w:val="1"/>
+          <w:numId w:val="3"/>
         </w:numPr>
         <w:rPr>
           <w:rFonts w:ascii="Segoe UI" w:hAnsi="Segoe UI" w:cs="Segoe UI"/>
         </w:rPr>
       </w:pPr>
-      <w:r>
-        <w:rPr>
-          <w:rFonts w:ascii="Segoe UI" w:hAnsi="Segoe UI" w:cs="Segoe UI"/>
-        </w:rPr>
-        <w:t>Le message doit être compréhensible immédiatement par votre public cible.</w:t>
+      <w:proofErr w:type="gramStart"/>
+      <w:r>
+        <w:rPr>
+          <w:rFonts w:ascii="Segoe UI" w:hAnsi="Segoe UI" w:cs="Segoe UI"/>
+        </w:rPr>
+        <w:t>repérer</w:t>
+      </w:r>
+      <w:proofErr w:type="gramEnd"/>
+      <w:r>
+        <w:rPr>
+          <w:rFonts w:ascii="Segoe UI" w:hAnsi="Segoe UI" w:cs="Segoe UI"/>
+        </w:rPr>
+        <w:t xml:space="preserve"> une image générée par IA ;</w:t>
       </w:r>
     </w:p>
     <w:p>
       <w:pPr>
         <w:numPr>
           <w:ilvl w:val="0"/>
-          <w:numId w:val="1"/>
+          <w:numId w:val="3"/>
         </w:numPr>
         <w:rPr>
           <w:rFonts w:ascii="Segoe UI" w:hAnsi="Segoe UI" w:cs="Segoe UI"/>
         </w:rPr>
       </w:pPr>
-      <w:r>
-        <w:rPr>
-          <w:rFonts w:ascii="Segoe UI" w:hAnsi="Segoe UI" w:cs="Segoe UI"/>
-        </w:rPr>
-        <w:t>Vous êtes libres de choisir la mise en page et les éléments graphiques.</w:t>
+      <w:proofErr w:type="gramStart"/>
+      <w:r>
+        <w:rPr>
+          <w:rFonts w:ascii="Segoe UI" w:hAnsi="Segoe UI" w:cs="Segoe UI"/>
+        </w:rPr>
+        <w:t>comprendre</w:t>
+      </w:r>
+      <w:proofErr w:type="gramEnd"/>
+      <w:r>
+        <w:rPr>
+          <w:rFonts w:ascii="Segoe UI" w:hAnsi="Segoe UI" w:cs="Segoe UI"/>
+        </w:rPr>
+        <w:t xml:space="preserve"> le fonctionnement des algorithmes ;</w:t>
       </w:r>
     </w:p>
     <w:p>
       <w:pPr>
+        <w:numPr>
+          <w:ilvl w:val="0"/>
+          <w:numId w:val="3"/>
+        </w:numPr>
+        <w:rPr>
+          <w:rFonts w:ascii="Segoe UI" w:hAnsi="Segoe UI" w:cs="Segoe UI"/>
+        </w:rPr>
+      </w:pPr>
+      <w:proofErr w:type="gramStart"/>
+      <w:r>
+        <w:rPr>
+          <w:rFonts w:ascii="Segoe UI" w:hAnsi="Segoe UI" w:cs="Segoe UI"/>
+        </w:rPr>
+        <w:t>distinguer</w:t>
+      </w:r>
+      <w:proofErr w:type="gramEnd"/>
+      <w:r>
+        <w:rPr>
+          <w:rFonts w:ascii="Segoe UI" w:hAnsi="Segoe UI" w:cs="Segoe UI"/>
+        </w:rPr>
+        <w:t xml:space="preserve"> information, opinion et publicité ;</w:t>
+      </w:r>
+    </w:p>
+    <w:p>
+      <w:pPr>
+        <w:numPr>
+          <w:ilvl w:val="0"/>
+          <w:numId w:val="3"/>
+        </w:numPr>
+        <w:rPr>
+          <w:rFonts w:ascii="Segoe UI" w:hAnsi="Segoe UI" w:cs="Segoe UI"/>
+        </w:rPr>
+      </w:pPr>
+      <w:proofErr w:type="gramStart"/>
+      <w:r>
+        <w:rPr>
+          <w:rFonts w:ascii="Segoe UI" w:hAnsi="Segoe UI" w:cs="Segoe UI"/>
+        </w:rPr>
+        <w:t>repérer</w:t>
+      </w:r>
+      <w:proofErr w:type="gramEnd"/>
+      <w:r>
+        <w:rPr>
+          <w:rFonts w:ascii="Segoe UI" w:hAnsi="Segoe UI" w:cs="Segoe UI"/>
+        </w:rPr>
+        <w:t xml:space="preserve"> une technique de manipulation ;</w:t>
+      </w:r>
+    </w:p>
+    <w:p>
+      <w:pPr>
+        <w:numPr>
+          <w:ilvl w:val="0"/>
+          <w:numId w:val="3"/>
+        </w:numPr>
+        <w:rPr>
+          <w:rFonts w:ascii="Segoe UI" w:hAnsi="Segoe UI" w:cs="Segoe UI"/>
+        </w:rPr>
+      </w:pPr>
+      <w:proofErr w:type="gramStart"/>
+      <w:r>
+        <w:rPr>
+          <w:rFonts w:ascii="Segoe UI" w:hAnsi="Segoe UI" w:cs="Segoe UI"/>
+        </w:rPr>
+        <w:t>comprendre</w:t>
+      </w:r>
+      <w:proofErr w:type="gramEnd"/>
+      <w:r>
+        <w:rPr>
+          <w:rFonts w:ascii="Segoe UI" w:hAnsi="Segoe UI" w:cs="Segoe UI"/>
+        </w:rPr>
+        <w:t xml:space="preserve"> les bulles informationnelles ;</w:t>
+      </w:r>
+    </w:p>
+    <w:p>
+      <w:pPr>
+        <w:numPr>
+          <w:ilvl w:val="0"/>
+          <w:numId w:val="3"/>
+        </w:numPr>
+        <w:rPr>
+          <w:rFonts w:ascii="Segoe UI" w:hAnsi="Segoe UI" w:cs="Segoe UI"/>
+        </w:rPr>
+      </w:pPr>
+      <w:proofErr w:type="gramStart"/>
+      <w:r>
+        <w:rPr>
+          <w:rFonts w:ascii="Segoe UI" w:hAnsi="Segoe UI" w:cs="Segoe UI"/>
+        </w:rPr>
+        <w:t>vérifier</w:t>
+      </w:r>
+      <w:proofErr w:type="gramEnd"/>
+      <w:r>
+        <w:rPr>
+          <w:rFonts w:ascii="Segoe UI" w:hAnsi="Segoe UI" w:cs="Segoe UI"/>
+        </w:rPr>
+        <w:t xml:space="preserve"> une information avant de la partager ;</w:t>
+      </w:r>
+    </w:p>
+    <w:p>
+      <w:pPr>
+        <w:numPr>
+          <w:ilvl w:val="0"/>
+          <w:numId w:val="3"/>
+        </w:numPr>
+        <w:rPr>
+          <w:rFonts w:ascii="Segoe UI" w:hAnsi="Segoe UI" w:cs="Segoe UI"/>
+        </w:rPr>
+      </w:pPr>
+      <w:proofErr w:type="gramStart"/>
+      <w:r>
+        <w:rPr>
+          <w:rFonts w:ascii="Segoe UI" w:hAnsi="Segoe UI" w:cs="Segoe UI"/>
+        </w:rPr>
+        <w:t>identifier</w:t>
+      </w:r>
+      <w:proofErr w:type="gramEnd"/>
+      <w:r>
+        <w:rPr>
+          <w:rFonts w:ascii="Segoe UI" w:hAnsi="Segoe UI" w:cs="Segoe UI"/>
+        </w:rPr>
+        <w:t xml:space="preserve"> un contenu sponsorisé ou une publicité déguisée.</w:t>
+      </w:r>
+    </w:p>
+    <w:p>
+      <w:pPr>
+        <w:rPr>
+          <w:rFonts w:ascii="Segoe UI" w:hAnsi="Segoe UI" w:cs="Segoe UI"/>
+        </w:rPr>
+      </w:pPr>
+      <w:r>
+        <w:rPr>
+          <w:rFonts w:ascii="Segoe UI" w:hAnsi="Segoe UI" w:cs="Segoe UI"/>
+        </w:rPr>
+        <w:t xml:space="preserve">Produisez une vidéo </w:t>
+      </w:r>
+      <w:r>
         <w:rPr>
           <w:rFonts w:ascii="Segoe UI" w:hAnsi="Segoe UI" w:cs="Segoe UI"/>
           <w:b/>
           <w:bCs/>
         </w:rPr>
-      </w:pPr>
-      <w:r>
+        <w:t>courte, dynamique et compréhensible</w:t>
+      </w:r>
+      <w:r>
+        <w:rPr>
+          <w:rFonts w:ascii="Segoe UI" w:hAnsi="Segoe UI" w:cs="Segoe UI"/>
+        </w:rPr>
+        <w:t xml:space="preserve">, pensée pour être publiée sur </w:t>
+      </w:r>
+      <w:proofErr w:type="spellStart"/>
+      <w:r>
+        <w:rPr>
+          <w:rFonts w:ascii="Segoe UI" w:hAnsi="Segoe UI" w:cs="Segoe UI"/>
+        </w:rPr>
+        <w:t>TikTok</w:t>
+      </w:r>
+      <w:proofErr w:type="spellEnd"/>
+      <w:r>
+        <w:rPr>
+          <w:rFonts w:ascii="Segoe UI" w:hAnsi="Segoe UI" w:cs="Segoe UI"/>
+        </w:rPr>
+        <w:t xml:space="preserve">, Instagram </w:t>
+      </w:r>
+      <w:proofErr w:type="spellStart"/>
+      <w:r>
+        <w:rPr>
+          <w:rFonts w:ascii="Segoe UI" w:hAnsi="Segoe UI" w:cs="Segoe UI"/>
+        </w:rPr>
+        <w:t>Reels</w:t>
+      </w:r>
+      <w:proofErr w:type="spellEnd"/>
+      <w:r>
+        <w:rPr>
+          <w:rFonts w:ascii="Segoe UI" w:hAnsi="Segoe UI" w:cs="Segoe UI"/>
+        </w:rPr>
+        <w:t xml:space="preserve"> ou YouTube Shorts.</w:t>
+      </w:r>
+    </w:p>
+    <w:p>
+      <w:pPr>
         <w:rPr>
           <w:rFonts w:ascii="Segoe UI" w:hAnsi="Segoe UI" w:cs="Segoe UI"/>
           <w:b/>
           <w:bCs/>
         </w:rPr>
-        <w:t>À la fin du défi</w:t>
+      </w:pPr>
+      <w:r>
+        <w:rPr>
+          <w:rFonts w:ascii="Segoe UI" w:hAnsi="Segoe UI" w:cs="Segoe UI"/>
+          <w:b/>
+          <w:bCs/>
+        </w:rPr>
+        <w:t>Contraintes</w:t>
       </w:r>
     </w:p>
     <w:p>
@@ -214,85 +541,177 @@
       </w:pPr>
       <w:r>
         <w:rPr>
-          <w:rFonts w:ascii="Segoe UI" w:hAnsi="Segoe UI" w:cs="Segoe UI"/>
-        </w:rPr>
-        <w:t>Présentez votre affiche au groupe en 1 minute et expliquez :</w:t>
+          <w:rFonts w:ascii="Segoe UI Symbol" w:hAnsi="Segoe UI Symbol" w:cs="Segoe UI Symbol"/>
+        </w:rPr>
+        <w:t>⏱</w:t>
+      </w:r>
+      <w:r>
+        <w:rPr>
+          <w:rFonts w:ascii="Segoe UI" w:hAnsi="Segoe UI" w:cs="Segoe UI"/>
+        </w:rPr>
+        <w:t xml:space="preserve"> </w:t>
+      </w:r>
+      <w:r>
+        <w:rPr>
+          <w:rFonts w:ascii="Segoe UI" w:hAnsi="Segoe UI" w:cs="Segoe UI"/>
+          <w:b/>
+          <w:bCs/>
+        </w:rPr>
+        <w:t>50 minutes maximum</w:t>
+      </w:r>
+      <w:r>
+        <w:rPr>
+          <w:rFonts w:ascii="Segoe UI" w:hAnsi="Segoe UI" w:cs="Segoe UI"/>
+        </w:rPr>
+        <w:t xml:space="preserve"> pour concevoir et réaliser la vidéo</w:t>
+      </w:r>
+      <w:r>
+        <w:rPr>
+          <w:rFonts w:ascii="Segoe UI" w:hAnsi="Segoe UI" w:cs="Segoe UI"/>
+        </w:rPr>
+        <w:br/>
+      </w:r>
+      <w:r>
+        <w:rPr>
+          <w:rFonts w:ascii="Segoe UI Emoji" w:hAnsi="Segoe UI Emoji" w:cs="Segoe UI Emoji"/>
+        </w:rPr>
+        <w:t>🎬</w:t>
+      </w:r>
+      <w:r>
+        <w:rPr>
+          <w:rFonts w:ascii="Segoe UI" w:hAnsi="Segoe UI" w:cs="Segoe UI"/>
+        </w:rPr>
+        <w:t xml:space="preserve"> </w:t>
+      </w:r>
+      <w:r>
+        <w:rPr>
+          <w:rFonts w:ascii="Segoe UI" w:hAnsi="Segoe UI" w:cs="Segoe UI"/>
+          <w:b/>
+          <w:bCs/>
+        </w:rPr>
+        <w:t>30 secondes à 1 minute</w:t>
+      </w:r>
+      <w:r>
+        <w:rPr>
+          <w:rFonts w:ascii="Segoe UI" w:hAnsi="Segoe UI" w:cs="Segoe UI"/>
+        </w:rPr>
+        <w:br/>
+      </w:r>
+      <w:r>
+        <w:rPr>
+          <w:rFonts w:ascii="Segoe UI Emoji" w:hAnsi="Segoe UI Emoji" w:cs="Segoe UI Emoji"/>
+        </w:rPr>
+        <w:t>📱</w:t>
+      </w:r>
+      <w:r>
+        <w:rPr>
+          <w:rFonts w:ascii="Segoe UI" w:hAnsi="Segoe UI" w:cs="Segoe UI"/>
+        </w:rPr>
+        <w:t xml:space="preserve"> Format vertical privilégié (</w:t>
+      </w:r>
+      <w:proofErr w:type="gramStart"/>
+      <w:r>
+        <w:rPr>
+          <w:rFonts w:ascii="Segoe UI" w:hAnsi="Segoe UI" w:cs="Segoe UI"/>
+        </w:rPr>
+        <w:t>9:</w:t>
+      </w:r>
+      <w:proofErr w:type="gramEnd"/>
+      <w:r>
+        <w:rPr>
+          <w:rFonts w:ascii="Segoe UI" w:hAnsi="Segoe UI" w:cs="Segoe UI"/>
+        </w:rPr>
+        <w:t>16)</w:t>
+      </w:r>
+      <w:r>
+        <w:rPr>
+          <w:rFonts w:ascii="Segoe UI" w:hAnsi="Segoe UI" w:cs="Segoe UI"/>
+        </w:rPr>
+        <w:br/>
+      </w:r>
+      <w:r>
+        <w:rPr>
+          <w:rFonts w:ascii="Segoe UI Emoji" w:hAnsi="Segoe UI Emoji" w:cs="Segoe UI Emoji"/>
+        </w:rPr>
+        <w:t>🎯</w:t>
+      </w:r>
+      <w:r>
+        <w:rPr>
+          <w:rFonts w:ascii="Segoe UI" w:hAnsi="Segoe UI" w:cs="Segoe UI"/>
+        </w:rPr>
+        <w:t xml:space="preserve"> Un seul message ou apprentissage central</w:t>
+      </w:r>
+      <w:r>
+        <w:rPr>
+          <w:rFonts w:ascii="Segoe UI" w:hAnsi="Segoe UI" w:cs="Segoe UI"/>
+        </w:rPr>
+        <w:br/>
+      </w:r>
+      <w:r>
+        <w:rPr>
+          <w:rFonts w:ascii="Segoe UI Emoji" w:hAnsi="Segoe UI Emoji" w:cs="Segoe UI Emoji"/>
+        </w:rPr>
+        <w:t>👥</w:t>
+      </w:r>
+      <w:r>
+        <w:rPr>
+          <w:rFonts w:ascii="Segoe UI" w:hAnsi="Segoe UI" w:cs="Segoe UI"/>
+        </w:rPr>
+        <w:t xml:space="preserve"> Travail en équipe</w:t>
+      </w:r>
+      <w:r>
+        <w:rPr>
+          <w:rFonts w:ascii="Segoe UI" w:hAnsi="Segoe UI" w:cs="Segoe UI"/>
+        </w:rPr>
+        <w:br/>
+      </w:r>
+      <w:r>
+        <w:rPr>
+          <w:rFonts w:ascii="Segoe UI Symbol" w:hAnsi="Segoe UI Symbol" w:cs="Segoe UI Symbol"/>
+        </w:rPr>
+        <w:t>🛠</w:t>
+      </w:r>
+      <w:r>
+        <w:rPr>
+          <w:rFonts w:ascii="Segoe UI" w:hAnsi="Segoe UI" w:cs="Segoe UI"/>
+        </w:rPr>
+        <w:t xml:space="preserve"> Utilisation libre des outils disponibles : smartphone, </w:t>
+      </w:r>
+      <w:proofErr w:type="spellStart"/>
+      <w:r>
+        <w:rPr>
+          <w:rFonts w:ascii="Segoe UI" w:hAnsi="Segoe UI" w:cs="Segoe UI"/>
+        </w:rPr>
+        <w:t>Canva</w:t>
+      </w:r>
+      <w:proofErr w:type="spellEnd"/>
+      <w:r>
+        <w:rPr>
+          <w:rFonts w:ascii="Segoe UI" w:hAnsi="Segoe UI" w:cs="Segoe UI"/>
+        </w:rPr>
+        <w:t xml:space="preserve">, </w:t>
+      </w:r>
+      <w:proofErr w:type="spellStart"/>
+      <w:r>
+        <w:rPr>
+          <w:rFonts w:ascii="Segoe UI" w:hAnsi="Segoe UI" w:cs="Segoe UI"/>
+        </w:rPr>
+        <w:t>CapCut</w:t>
+      </w:r>
+      <w:proofErr w:type="spellEnd"/>
+      <w:r>
+        <w:rPr>
+          <w:rFonts w:ascii="Segoe UI" w:hAnsi="Segoe UI" w:cs="Segoe UI"/>
+        </w:rPr>
+        <w:t>, IA générative, etc.</w:t>
       </w:r>
     </w:p>
     <w:p>
       <w:pPr>
-        <w:numPr>
-          <w:ilvl w:val="0"/>
-          <w:numId w:val="2"/>
-        </w:numPr>
-        <w:rPr>
-          <w:rFonts w:ascii="Segoe UI" w:hAnsi="Segoe UI" w:cs="Segoe UI"/>
-        </w:rPr>
-      </w:pPr>
-      <w:proofErr w:type="gramStart"/>
-      <w:r>
-        <w:rPr>
-          <w:rFonts w:ascii="Segoe UI" w:hAnsi="Segoe UI" w:cs="Segoe UI"/>
-        </w:rPr>
-        <w:t>vos</w:t>
-      </w:r>
-      <w:proofErr w:type="gramEnd"/>
-      <w:r>
-        <w:rPr>
-          <w:rFonts w:ascii="Segoe UI" w:hAnsi="Segoe UI" w:cs="Segoe UI"/>
-        </w:rPr>
-        <w:t xml:space="preserve"> principaux choix ;</w:t>
-      </w:r>
-    </w:p>
-    <w:p>
-      <w:pPr>
-        <w:numPr>
-          <w:ilvl w:val="0"/>
-          <w:numId w:val="2"/>
-        </w:numPr>
-        <w:rPr>
-          <w:rFonts w:ascii="Segoe UI" w:hAnsi="Segoe UI" w:cs="Segoe UI"/>
-        </w:rPr>
-      </w:pPr>
-      <w:proofErr w:type="gramStart"/>
-      <w:r>
-        <w:rPr>
-          <w:rFonts w:ascii="Segoe UI" w:hAnsi="Segoe UI" w:cs="Segoe UI"/>
-        </w:rPr>
-        <w:t>comment</w:t>
-      </w:r>
-      <w:proofErr w:type="gramEnd"/>
-      <w:r>
-        <w:rPr>
-          <w:rFonts w:ascii="Segoe UI" w:hAnsi="Segoe UI" w:cs="Segoe UI"/>
-        </w:rPr>
-        <w:t xml:space="preserve"> vous avez respecté les contraintes ;</w:t>
-      </w:r>
-    </w:p>
-    <w:p>
-      <w:pPr>
-        <w:numPr>
-          <w:ilvl w:val="0"/>
-          <w:numId w:val="2"/>
-        </w:numPr>
-        <w:rPr>
-          <w:rFonts w:ascii="Segoe UI" w:hAnsi="Segoe UI" w:cs="Segoe UI"/>
-        </w:rPr>
-      </w:pPr>
-      <w:proofErr w:type="gramStart"/>
-      <w:r>
-        <w:rPr>
-          <w:rFonts w:ascii="Segoe UI" w:hAnsi="Segoe UI" w:cs="Segoe UI"/>
-        </w:rPr>
-        <w:t>ce</w:t>
-      </w:r>
-      <w:proofErr w:type="gramEnd"/>
-      <w:r>
-        <w:rPr>
-          <w:rFonts w:ascii="Segoe UI" w:hAnsi="Segoe UI" w:cs="Segoe UI"/>
-        </w:rPr>
-        <w:t xml:space="preserve"> qui rend votre affiche efficace pour le public visé.</w:t>
-      </w:r>
+        <w:rPr>
+          <w:rFonts w:ascii="Segoe UI" w:hAnsi="Segoe UI" w:cs="Segoe UI"/>
+        </w:rPr>
+      </w:pPr>
     </w:p>
     <w:p/>
     <w:sectPr>
@@ -457,6 +876,155 @@
     </w:lvl>
   </w:abstractNum>
   <w:abstractNum w:abstractNumId="1" w15:restartNumberingAfterBreak="0">
+    <w:nsid w:val="24EF1A6B"/>
+    <w:multiLevelType w:val="multilevel"/>
+    <w:tmpl w:val="433E29F6"/>
+    <w:lvl w:ilvl="0">
+      <w:start w:val="1"/>
+      <w:numFmt w:val="bullet"/>
+      <w:lvlText w:val=""/>
+      <w:lvlJc w:val="left"/>
+      <w:pPr>
+        <w:tabs>
+          <w:tab w:val="num" w:pos="720"/>
+        </w:tabs>
+        <w:ind w:left="720" w:hanging="360"/>
+      </w:pPr>
+      <w:rPr>
+        <w:rFonts w:ascii="Symbol" w:hAnsi="Symbol" w:hint="default"/>
+        <w:sz w:val="20"/>
+      </w:rPr>
+    </w:lvl>
+    <w:lvl w:ilvl="1" w:tentative="1">
+      <w:start w:val="1"/>
+      <w:numFmt w:val="bullet"/>
+      <w:lvlText w:val="o"/>
+      <w:lvlJc w:val="left"/>
+      <w:pPr>
+        <w:tabs>
+          <w:tab w:val="num" w:pos="1440"/>
+        </w:tabs>
+        <w:ind w:left="1440" w:hanging="360"/>
+      </w:pPr>
+      <w:rPr>
+        <w:rFonts w:ascii="Courier New" w:hAnsi="Courier New" w:hint="default"/>
+        <w:sz w:val="20"/>
+      </w:rPr>
+    </w:lvl>
+    <w:lvl w:ilvl="2" w:tentative="1">
+      <w:start w:val="1"/>
+      <w:numFmt w:val="bullet"/>
+      <w:lvlText w:val=""/>
+      <w:lvlJc w:val="left"/>
+      <w:pPr>
+        <w:tabs>
+          <w:tab w:val="num" w:pos="2160"/>
+        </w:tabs>
+        <w:ind w:left="2160" w:hanging="360"/>
+      </w:pPr>
+      <w:rPr>
+        <w:rFonts w:ascii="Wingdings" w:hAnsi="Wingdings" w:hint="default"/>
+        <w:sz w:val="20"/>
+      </w:rPr>
+    </w:lvl>
+    <w:lvl w:ilvl="3" w:tentative="1">
+      <w:start w:val="1"/>
+      <w:numFmt w:val="bullet"/>
+      <w:lvlText w:val=""/>
+      <w:lvlJc w:val="left"/>
+      <w:pPr>
+        <w:tabs>
+          <w:tab w:val="num" w:pos="2880"/>
+        </w:tabs>
+        <w:ind w:left="2880" w:hanging="360"/>
+      </w:pPr>
+      <w:rPr>
+        <w:rFonts w:ascii="Wingdings" w:hAnsi="Wingdings" w:hint="default"/>
+        <w:sz w:val="20"/>
+      </w:rPr>
+    </w:lvl>
+    <w:lvl w:ilvl="4" w:tentative="1">
+      <w:start w:val="1"/>
+      <w:numFmt w:val="bullet"/>
+      <w:lvlText w:val=""/>
+      <w:lvlJc w:val="left"/>
+      <w:pPr>
+        <w:tabs>
+          <w:tab w:val="num" w:pos="3600"/>
+        </w:tabs>
+        <w:ind w:left="3600" w:hanging="360"/>
+      </w:pPr>
+      <w:rPr>
+        <w:rFonts w:ascii="Wingdings" w:hAnsi="Wingdings" w:hint="default"/>
+        <w:sz w:val="20"/>
+      </w:rPr>
+    </w:lvl>
+    <w:lvl w:ilvl="5" w:tentative="1">
+      <w:start w:val="1"/>
+      <w:numFmt w:val="bullet"/>
+      <w:lvlText w:val=""/>
+      <w:lvlJc w:val="left"/>
+      <w:pPr>
+        <w:tabs>
+          <w:tab w:val="num" w:pos="4320"/>
+        </w:tabs>
+        <w:ind w:left="4320" w:hanging="360"/>
+      </w:pPr>
+      <w:rPr>
+        <w:rFonts w:ascii="Wingdings" w:hAnsi="Wingdings" w:hint="default"/>
+        <w:sz w:val="20"/>
+      </w:rPr>
+    </w:lvl>
+    <w:lvl w:ilvl="6" w:tentative="1">
+      <w:start w:val="1"/>
+      <w:numFmt w:val="bullet"/>
+      <w:lvlText w:val=""/>
+      <w:lvlJc w:val="left"/>
+      <w:pPr>
+        <w:tabs>
+          <w:tab w:val="num" w:pos="5040"/>
+        </w:tabs>
+        <w:ind w:left="5040" w:hanging="360"/>
+      </w:pPr>
+      <w:rPr>
+        <w:rFonts w:ascii="Wingdings" w:hAnsi="Wingdings" w:hint="default"/>
+        <w:sz w:val="20"/>
+      </w:rPr>
+    </w:lvl>
+    <w:lvl w:ilvl="7" w:tentative="1">
+      <w:start w:val="1"/>
+      <w:numFmt w:val="bullet"/>
+      <w:lvlText w:val=""/>
+      <w:lvlJc w:val="left"/>
+      <w:pPr>
+        <w:tabs>
+          <w:tab w:val="num" w:pos="5760"/>
+        </w:tabs>
+        <w:ind w:left="5760" w:hanging="360"/>
+      </w:pPr>
+      <w:rPr>
+        <w:rFonts w:ascii="Wingdings" w:hAnsi="Wingdings" w:hint="default"/>
+        <w:sz w:val="20"/>
+      </w:rPr>
+    </w:lvl>
+    <w:lvl w:ilvl="8" w:tentative="1">
+      <w:start w:val="1"/>
+      <w:numFmt w:val="bullet"/>
+      <w:lvlText w:val=""/>
+      <w:lvlJc w:val="left"/>
+      <w:pPr>
+        <w:tabs>
+          <w:tab w:val="num" w:pos="6480"/>
+        </w:tabs>
+        <w:ind w:left="6480" w:hanging="360"/>
+      </w:pPr>
+      <w:rPr>
+        <w:rFonts w:ascii="Wingdings" w:hAnsi="Wingdings" w:hint="default"/>
+        <w:sz w:val="20"/>
+      </w:rPr>
+    </w:lvl>
+  </w:abstractNum>
+  <w:abstractNum w:abstractNumId="2" w15:restartNumberingAfterBreak="0">
     <w:nsid w:val="6CDC060B"/>
     <w:multiLevelType w:val="multilevel"/>
     <w:tmpl w:val="2E48EE0C"/>
@@ -609,6 +1177,9 @@
     <w:abstractNumId w:val="0"/>
   </w:num>
   <w:num w:numId="2" w16cid:durableId="1809664192">
+    <w:abstractNumId w:val="2"/>
+  </w:num>
+  <w:num w:numId="3" w16cid:durableId="358094326">
     <w:abstractNumId w:val="1"/>
   </w:num>
 </w:numbering>

</xml_diff>